<commit_message>
Add name and roll number to report
</commit_message>
<xml_diff>
--- a/report/MLOps_Assignment1_Report.docx
+++ b/report/MLOps_Assignment1_Report.docx
@@ -52,7 +52,7 @@
         <w:rPr>
           <w:sz w:val="26"/>
         </w:rPr>
-        <w:t>Name: [Your full name]</w:t>
+        <w:t>Name: Sri Vishnu Vallabh Yathavakilla</w:t>
       </w:r>
     </w:p>
     <w:p>
@@ -63,7 +63,7 @@
         <w:rPr>
           <w:sz w:val="26"/>
         </w:rPr>
-        <w:t>BITS ID: [Your BITS ID]</w:t>
+        <w:t>Roll No. (BITS ID): 2025AE05312</w:t>
       </w:r>
     </w:p>
     <w:p>

</xml_diff>

<commit_message>
Add video demo link to report and README
</commit_message>
<xml_diff>
--- a/report/MLOps_Assignment1_Report.docx
+++ b/report/MLOps_Assignment1_Report.docx
@@ -96,7 +96,7 @@
         <w:rPr>
           <w:sz w:val="26"/>
         </w:rPr>
-        <w:t>Video: [video link]</w:t>
+        <w:t>Video demo: https://drive.google.com/file/d/1TrkfXdka5RmZLJbSianmY-37O-BMll1f/view?usp=share_link</w:t>
       </w:r>
     </w:p>
     <w:p>
@@ -2692,7 +2692,7 @@
         <w:pStyle w:val="ListBullet"/>
       </w:pPr>
       <w:r>
-        <w:t>Video: [video link]</w:t>
+        <w:t>Video demo: https://drive.google.com/file/d/1TrkfXdka5RmZLJbSianmY-37O-BMll1f/view?usp=share_link</w:t>
       </w:r>
     </w:p>
     <w:sectPr>

</xml_diff>